<commit_message>
Regera indice do acervo em Word com a secao de formatos
Co-Authored-By: Claude Opus 5 <noreply@anthropic.com>
Claude-Session: https://claude.ai/code/session_01WskqdRgf4gJL8UJJrJh7bY
</commit_message>
<xml_diff>
--- a/modelos-contratos/docx/README.docx
+++ b/modelos-contratos/docx/README.docx
@@ -32,6 +32,290 @@
           <w:szCs w:val="24"/>
         </w:rPr>
         <w:t xml:space="preserve">Coletânea de minutas contratuais elaboradas para uso do escritório, com fundamentação na legislação, doutrina e jurisprudência vigentes.</w:t>
+      </w:r>
+    </w:p>
+    <w:p>
+      <w:pPr>
+        <w:pStyle w:val="Heading1"/>
+        <w:keepNext/>
+        <w:spacing w:after="140" w:before="300"/>
+        <w:jc w:val="left"/>
+      </w:pPr>
+      <w:r>
+        <w:rPr>
+          <w:rFonts w:ascii="Times New Roman" w:cs="Times New Roman" w:eastAsia="Times New Roman" w:hAnsi="Times New Roman"/>
+          <w:b/>
+          <w:bCs/>
+          <w:color w:val="1A1A1A"/>
+          <w:sz w:val="24"/>
+          <w:szCs w:val="24"/>
+        </w:rPr>
+        <w:t xml:space="preserve">Formatos disponíveis</w:t>
+      </w:r>
+    </w:p>
+    <w:p>
+      <w:pPr>
+        <w:spacing w:after="140" w:line="276"/>
+        <w:ind w:left="0" w:right="0"/>
+        <w:jc w:val="both"/>
+      </w:pPr>
+      <w:r>
+        <w:rPr>
+          <w:rFonts w:ascii="Times New Roman" w:cs="Times New Roman" w:eastAsia="Times New Roman" w:hAnsi="Times New Roman"/>
+          <w:sz w:val="24"/>
+          <w:szCs w:val="24"/>
+        </w:rPr>
+        <w:t xml:space="preserve">Cada modelo existe em duas versões:</w:t>
+      </w:r>
+    </w:p>
+    <w:p>
+      <w:pPr>
+        <w:pStyle w:val="ListParagraph"/>
+        <w:numPr>
+          <w:ilvl w:val="0"/>
+          <w:numId w:val="2"/>
+        </w:numPr>
+        <w:spacing w:after="100" w:line="276"/>
+        <w:jc w:val="both"/>
+      </w:pPr>
+      <w:r>
+        <w:rPr>
+          <w:rFonts w:ascii="Times New Roman" w:cs="Times New Roman" w:eastAsia="Times New Roman" w:hAnsi="Times New Roman"/>
+          <w:b/>
+          <w:bCs/>
+          <w:sz w:val="24"/>
+          <w:szCs w:val="24"/>
+        </w:rPr>
+        <w:t xml:space="preserve">Markdown</w:t>
+      </w:r>
+      <w:r>
+        <w:rPr>
+          <w:rFonts w:ascii="Times New Roman" w:cs="Times New Roman" w:eastAsia="Times New Roman" w:hAnsi="Times New Roman"/>
+          <w:sz w:val="24"/>
+          <w:szCs w:val="24"/>
+        </w:rPr>
+        <w:t xml:space="preserve"> (</w:t>
+      </w:r>
+      <w:r>
+        <w:rPr>
+          <w:rFonts w:ascii="Consolas" w:cs="Consolas" w:eastAsia="Consolas" w:hAnsi="Consolas"/>
+          <w:sz w:val="22"/>
+          <w:szCs w:val="22"/>
+        </w:rPr>
+        <w:t xml:space="preserve">.md</w:t>
+      </w:r>
+      <w:r>
+        <w:rPr>
+          <w:rFonts w:ascii="Times New Roman" w:cs="Times New Roman" w:eastAsia="Times New Roman" w:hAnsi="Times New Roman"/>
+          <w:sz w:val="24"/>
+          <w:szCs w:val="24"/>
+        </w:rPr>
+        <w:t xml:space="preserve">) — nesta pasta, para leitura rápida, versionamento e comparação de alterações.</w:t>
+      </w:r>
+    </w:p>
+    <w:p>
+      <w:pPr>
+        <w:pStyle w:val="ListParagraph"/>
+        <w:numPr>
+          <w:ilvl w:val="0"/>
+          <w:numId w:val="2"/>
+        </w:numPr>
+        <w:spacing w:after="100" w:line="276"/>
+        <w:jc w:val="both"/>
+      </w:pPr>
+      <w:r>
+        <w:rPr>
+          <w:rFonts w:ascii="Times New Roman" w:cs="Times New Roman" w:eastAsia="Times New Roman" w:hAnsi="Times New Roman"/>
+          <w:b/>
+          <w:bCs/>
+          <w:sz w:val="24"/>
+          <w:szCs w:val="24"/>
+        </w:rPr>
+        <w:t xml:space="preserve">Word</w:t>
+      </w:r>
+      <w:r>
+        <w:rPr>
+          <w:rFonts w:ascii="Times New Roman" w:cs="Times New Roman" w:eastAsia="Times New Roman" w:hAnsi="Times New Roman"/>
+          <w:sz w:val="24"/>
+          <w:szCs w:val="24"/>
+        </w:rPr>
+        <w:t xml:space="preserve"> (</w:t>
+      </w:r>
+      <w:r>
+        <w:rPr>
+          <w:rFonts w:ascii="Consolas" w:cs="Consolas" w:eastAsia="Consolas" w:hAnsi="Consolas"/>
+          <w:sz w:val="22"/>
+          <w:szCs w:val="22"/>
+        </w:rPr>
+        <w:t xml:space="preserve">.docx</w:t>
+      </w:r>
+      <w:r>
+        <w:rPr>
+          <w:rFonts w:ascii="Times New Roman" w:cs="Times New Roman" w:eastAsia="Times New Roman" w:hAnsi="Times New Roman"/>
+          <w:sz w:val="24"/>
+          <w:szCs w:val="24"/>
+        </w:rPr>
+        <w:t xml:space="preserve">) — na subpasta </w:t>
+      </w:r>
+      <w:r>
+        <w:rPr>
+          <w:rFonts w:ascii="Consolas" w:cs="Consolas" w:eastAsia="Consolas" w:hAnsi="Consolas"/>
+          <w:sz w:val="22"/>
+          <w:szCs w:val="22"/>
+        </w:rPr>
+        <w:t xml:space="preserve">docx/</w:t>
+      </w:r>
+      <w:r>
+        <w:rPr>
+          <w:rFonts w:ascii="Times New Roman" w:cs="Times New Roman" w:eastAsia="Times New Roman" w:hAnsi="Times New Roman"/>
+          <w:sz w:val="24"/>
+          <w:szCs w:val="24"/>
+        </w:rPr>
+        <w:t xml:space="preserve">, pronta para edição e impressão: A4, margens forenses (3 cm à esquerda), Times New Roman 12, texto justificado, rodapé com numeração de páginas e blocos de assinatura já montados.</w:t>
+      </w:r>
+    </w:p>
+    <w:p>
+      <w:pPr>
+        <w:spacing w:after="140" w:line="276"/>
+        <w:ind w:left="0" w:right="0"/>
+        <w:jc w:val="both"/>
+      </w:pPr>
+      <w:r>
+        <w:rPr>
+          <w:rFonts w:ascii="Times New Roman" w:cs="Times New Roman" w:eastAsia="Times New Roman" w:hAnsi="Times New Roman"/>
+          <w:sz w:val="24"/>
+          <w:szCs w:val="24"/>
+        </w:rPr>
+        <w:t xml:space="preserve">Nos arquivos </w:t>
+      </w:r>
+      <w:r>
+        <w:rPr>
+          <w:rFonts w:ascii="Consolas" w:cs="Consolas" w:eastAsia="Consolas" w:hAnsi="Consolas"/>
+          <w:sz w:val="22"/>
+          <w:szCs w:val="22"/>
+        </w:rPr>
+        <w:t xml:space="preserve">.docx</w:t>
+      </w:r>
+      <w:r>
+        <w:rPr>
+          <w:rFonts w:ascii="Times New Roman" w:cs="Times New Roman" w:eastAsia="Times New Roman" w:hAnsi="Times New Roman"/>
+          <w:sz w:val="24"/>
+          <w:szCs w:val="24"/>
+        </w:rPr>
+        <w:t xml:space="preserve">, </w:t>
+      </w:r>
+      <w:r>
+        <w:rPr>
+          <w:rFonts w:ascii="Times New Roman" w:cs="Times New Roman" w:eastAsia="Times New Roman" w:hAnsi="Times New Roman"/>
+          <w:b/>
+          <w:bCs/>
+          <w:sz w:val="24"/>
+          <w:szCs w:val="24"/>
+        </w:rPr>
+        <w:t xml:space="preserve">todo campo de preenchimento aparece realçado em amarelo</w:t>
+      </w:r>
+      <w:r>
+        <w:rPr>
+          <w:rFonts w:ascii="Times New Roman" w:cs="Times New Roman" w:eastAsia="Times New Roman" w:hAnsi="Times New Roman"/>
+          <w:sz w:val="24"/>
+          <w:szCs w:val="24"/>
+        </w:rPr>
+        <w:t xml:space="preserve"> (</w:t>
+      </w:r>
+      <w:r>
+        <w:rPr>
+          <w:rFonts w:ascii="Consolas" w:cs="Consolas" w:eastAsia="Consolas" w:hAnsi="Consolas"/>
+          <w:sz w:val="22"/>
+          <w:szCs w:val="22"/>
+        </w:rPr>
+        <w:t xml:space="preserve">[assim]</w:t>
+      </w:r>
+      <w:r>
+        <w:rPr>
+          <w:rFonts w:ascii="Times New Roman" w:cs="Times New Roman" w:eastAsia="Times New Roman" w:hAnsi="Times New Roman"/>
+          <w:sz w:val="24"/>
+          <w:szCs w:val="24"/>
+        </w:rPr>
+        <w:t xml:space="preserve">). Para retirar o realce depois de preencher, selecione tudo (Ctrl+A) e defina a cor de realce como "Sem cor".</w:t>
+      </w:r>
+    </w:p>
+    <w:p>
+      <w:pPr>
+        <w:spacing w:after="140" w:line="276"/>
+        <w:ind w:left="0" w:right="0"/>
+        <w:jc w:val="both"/>
+      </w:pPr>
+      <w:r>
+        <w:rPr>
+          <w:rFonts w:ascii="Times New Roman" w:cs="Times New Roman" w:eastAsia="Times New Roman" w:hAnsi="Times New Roman"/>
+          <w:sz w:val="24"/>
+          <w:szCs w:val="24"/>
+        </w:rPr>
+        <w:t xml:space="preserve">Os </w:t>
+      </w:r>
+      <w:r>
+        <w:rPr>
+          <w:rFonts w:ascii="Consolas" w:cs="Consolas" w:eastAsia="Consolas" w:hAnsi="Consolas"/>
+          <w:sz w:val="22"/>
+          <w:szCs w:val="22"/>
+        </w:rPr>
+        <w:t xml:space="preserve">.docx</w:t>
+      </w:r>
+      <w:r>
+        <w:rPr>
+          <w:rFonts w:ascii="Times New Roman" w:cs="Times New Roman" w:eastAsia="Times New Roman" w:hAnsi="Times New Roman"/>
+          <w:sz w:val="24"/>
+          <w:szCs w:val="24"/>
+        </w:rPr>
+        <w:t xml:space="preserve"> são gerados a partir dos </w:t>
+      </w:r>
+      <w:r>
+        <w:rPr>
+          <w:rFonts w:ascii="Consolas" w:cs="Consolas" w:eastAsia="Consolas" w:hAnsi="Consolas"/>
+          <w:sz w:val="22"/>
+          <w:szCs w:val="22"/>
+        </w:rPr>
+        <w:t xml:space="preserve">.md</w:t>
+      </w:r>
+      <w:r>
+        <w:rPr>
+          <w:rFonts w:ascii="Times New Roman" w:cs="Times New Roman" w:eastAsia="Times New Roman" w:hAnsi="Times New Roman"/>
+          <w:sz w:val="24"/>
+          <w:szCs w:val="24"/>
+        </w:rPr>
+        <w:t xml:space="preserve">. Ao alterar um modelo, edite o </w:t>
+      </w:r>
+      <w:r>
+        <w:rPr>
+          <w:rFonts w:ascii="Consolas" w:cs="Consolas" w:eastAsia="Consolas" w:hAnsi="Consolas"/>
+          <w:sz w:val="22"/>
+          <w:szCs w:val="22"/>
+        </w:rPr>
+        <w:t xml:space="preserve">.md</w:t>
+      </w:r>
+      <w:r>
+        <w:rPr>
+          <w:rFonts w:ascii="Times New Roman" w:cs="Times New Roman" w:eastAsia="Times New Roman" w:hAnsi="Times New Roman"/>
+          <w:sz w:val="24"/>
+          <w:szCs w:val="24"/>
+        </w:rPr>
+        <w:t xml:space="preserve"> e regere o </w:t>
+      </w:r>
+      <w:r>
+        <w:rPr>
+          <w:rFonts w:ascii="Consolas" w:cs="Consolas" w:eastAsia="Consolas" w:hAnsi="Consolas"/>
+          <w:sz w:val="22"/>
+          <w:szCs w:val="22"/>
+        </w:rPr>
+        <w:t xml:space="preserve">.docx</w:t>
+      </w:r>
+      <w:r>
+        <w:rPr>
+          <w:rFonts w:ascii="Times New Roman" w:cs="Times New Roman" w:eastAsia="Times New Roman" w:hAnsi="Times New Roman"/>
+          <w:sz w:val="24"/>
+          <w:szCs w:val="24"/>
+        </w:rPr>
+        <w:t xml:space="preserve"> para manter as duas versões sincronizadas.</w:t>
       </w:r>
     </w:p>
     <w:p>

</xml_diff>